<commit_message>
perf(db,live): add connection pooling, live model failure backoff, and robust Twilio logging
- add connection pool in database.py to reduce latency and connection churn
- add failure backoff and fast WarmUp error reporting in LiveIntelligence cache
- improve Twilio error response logging and handling in providers.py
- update final report DOCX and PDF
- update tests in test_database.py and test_live_intelligence.py
</commit_message>
<xml_diff>
--- a/docs/report/Sathi_Final_Report.docx
+++ b/docs/report/Sathi_Final_Report.docx
@@ -178,7 +178,7 @@
             <w:pPr>
               <w:spacing w:after="0"/>
             </w:pPr>
-            <w:hyperlink w:history="1" r:id="rIdmgbiy6ltglo4zgzwq1alr">
+            <w:hyperlink w:history="1" r:id="rIdbg9ssb7gmsi9wv5o2c5ky">
               <w:r>
                 <w:rPr>
                   <w:rFonts w:ascii="Calibri" w:cs="Nirmala UI" w:eastAsia="Calibri" w:hAnsi="Calibri"/>
@@ -247,7 +247,7 @@
             <w:pPr>
               <w:spacing w:after="0"/>
             </w:pPr>
-            <w:hyperlink w:history="1" r:id="rId-jshjm6_ah-bk01pkhlim">
+            <w:hyperlink w:history="1" r:id="rIdlxyqr5_o4gh9vsai850rr">
               <w:r>
                 <w:rPr>
                   <w:rFonts w:ascii="Calibri" w:cs="Nirmala UI" w:eastAsia="Calibri" w:hAnsi="Calibri"/>
@@ -316,7 +316,7 @@
             <w:pPr>
               <w:spacing w:after="0"/>
             </w:pPr>
-            <w:hyperlink w:history="1" r:id="rId5-udv_hf7kz_51su6ekne">
+            <w:hyperlink w:history="1" r:id="rIdy0bvylxjmaa_wepmsxd3y">
               <w:r>
                 <w:rPr>
                   <w:rFonts w:ascii="Calibri" w:cs="Nirmala UI" w:eastAsia="Calibri" w:hAnsi="Calibri"/>
@@ -698,7 +698,7 @@
           <w:b/>
           <w:bCs/>
         </w:rPr>
-        <w:t xml:space="preserve">560 backend + 60 frontend automated tests pass</w:t>
+        <w:t xml:space="preserve">563 backend + 60 frontend automated tests pass</w:t>
       </w:r>
       <w:r>
         <w:rPr>
@@ -1006,7 +1006,7 @@
               </w:rPr>
               <w:t xml:space="preserve">Bangladesh Bank data reported by </w:t>
             </w:r>
-            <w:hyperlink w:history="1" r:id="rIdzakfuopwpj-tel_wo2h3w">
+            <w:hyperlink w:history="1" r:id="rIdilswpky4qjsmpf_cyb-zt">
               <w:r>
                 <w:rPr>
                   <w:rFonts w:ascii="Calibri" w:cs="Nirmala UI" w:eastAsia="Calibri" w:hAnsi="Calibri"/>
@@ -1167,7 +1167,7 @@
               </w:rPr>
               <w:t xml:space="preserve">TIB, Governance Challenges in MFS Sector, </w:t>
             </w:r>
-            <w:hyperlink w:history="1" r:id="rIdrvdrvkayw7eunxohlugi4">
+            <w:hyperlink w:history="1" r:id="rIdirnqfgfsmft11j90m5dbs">
               <w:r>
                 <w:rPr>
                   <w:rFonts w:ascii="Calibri" w:cs="Nirmala UI" w:eastAsia="Calibri" w:hAnsi="Calibri"/>
@@ -1346,7 +1346,7 @@
               </w:rPr>
               <w:t xml:space="preserve">TIB, </w:t>
             </w:r>
-            <w:hyperlink w:history="1" r:id="rId3zlymmrwh72tprojyaipx">
+            <w:hyperlink w:history="1" r:id="rIdeonb-kvk-qncmb92kiyw7">
               <w:r>
                 <w:rPr>
                   <w:rFonts w:ascii="Calibri" w:cs="Nirmala UI" w:eastAsia="Calibri" w:hAnsi="Calibri"/>
@@ -1453,7 +1453,7 @@
               </w:rPr>
               <w:t xml:space="preserve">Shitol et al., International Journal of Social Welfare, </w:t>
             </w:r>
-            <w:hyperlink w:history="1" r:id="rIdzu0iqgz6bpylml9qmxmzn">
+            <w:hyperlink w:history="1" r:id="rIdr4bpgicpn5xq4g2ur5e4s">
               <w:r>
                 <w:rPr>
                   <w:rFonts w:ascii="Calibri" w:cs="Nirmala UI" w:eastAsia="Calibri" w:hAnsi="Calibri"/>
@@ -16869,7 +16869,7 @@
         </w:rPr>
         <w:t xml:space="preserve">Repository: </w:t>
       </w:r>
-      <w:hyperlink w:history="1" r:id="rId5h_7c-wbgtlbxyvdc1o54">
+      <w:hyperlink w:history="1" r:id="rIdiyvda6gmv-jdbkicxsdjy">
         <w:r>
           <w:rPr>
             <w:rFonts w:ascii="Calibri" w:cs="Nirmala UI" w:eastAsia="Calibri" w:hAnsi="Calibri"/>
@@ -16947,7 +16947,7 @@
           <w:sz w:val="17"/>
           <w:szCs w:val="17"/>
         </w:rPr>
-        <w:t xml:space="preserve">make test lint                 # 560 backend + 60 frontend tests</w:t>
+        <w:t xml:space="preserve">make test lint                 # 563 backend + 60 frontend tests</w:t>
       </w:r>
     </w:p>
     <w:p>

</xml_diff>